<commit_message>
Docs: Update Test Plan
</commit_message>
<xml_diff>
--- a/Assignment2/Test Plan.docx
+++ b/Assignment2/Test Plan.docx
@@ -44,7 +44,7 @@
         </w:trPr>
         <w:tc>
           <w:tcPr>
-            <w:tcW w:w="582" w:type="dxa"/>
+            <w:tcW w:w="593" w:type="dxa"/>
             <w:tcBorders>
               <w:top w:val="single" w:sz="4" w:space="0" w:color="auto"/>
               <w:left w:val="single" w:sz="4" w:space="0" w:color="auto"/>
@@ -75,7 +75,7 @@
         </w:tc>
         <w:tc>
           <w:tcPr>
-            <w:tcW w:w="3568" w:type="dxa"/>
+            <w:tcW w:w="3563" w:type="dxa"/>
             <w:tcBorders>
               <w:top w:val="single" w:sz="4" w:space="0" w:color="auto"/>
               <w:left w:val="nil"/>
@@ -106,7 +106,7 @@
         </w:tc>
         <w:tc>
           <w:tcPr>
-            <w:tcW w:w="2839" w:type="dxa"/>
+            <w:tcW w:w="2836" w:type="dxa"/>
             <w:tcBorders>
               <w:top w:val="single" w:sz="4" w:space="0" w:color="auto"/>
               <w:left w:val="nil"/>
@@ -137,7 +137,7 @@
         </w:tc>
         <w:tc>
           <w:tcPr>
-            <w:tcW w:w="3218" w:type="dxa"/>
+            <w:tcW w:w="3215" w:type="dxa"/>
             <w:tcBorders>
               <w:top w:val="single" w:sz="4" w:space="0" w:color="auto"/>
               <w:left w:val="nil"/>
@@ -204,7 +204,7 @@
         </w:trPr>
         <w:tc>
           <w:tcPr>
-            <w:tcW w:w="582" w:type="dxa"/>
+            <w:tcW w:w="593" w:type="dxa"/>
             <w:tcBorders>
               <w:top w:val="nil"/>
               <w:left w:val="single" w:sz="4" w:space="0" w:color="auto"/>
@@ -236,7 +236,7 @@
         </w:tc>
         <w:tc>
           <w:tcPr>
-            <w:tcW w:w="3568" w:type="dxa"/>
+            <w:tcW w:w="3563" w:type="dxa"/>
             <w:tcBorders>
               <w:top w:val="nil"/>
               <w:left w:val="nil"/>
@@ -266,7 +266,7 @@
         </w:tc>
         <w:tc>
           <w:tcPr>
-            <w:tcW w:w="2839" w:type="dxa"/>
+            <w:tcW w:w="2836" w:type="dxa"/>
             <w:tcBorders>
               <w:top w:val="nil"/>
               <w:left w:val="nil"/>
@@ -296,7 +296,7 @@
         </w:tc>
         <w:tc>
           <w:tcPr>
-            <w:tcW w:w="3218" w:type="dxa"/>
+            <w:tcW w:w="3215" w:type="dxa"/>
             <w:tcBorders>
               <w:top w:val="nil"/>
               <w:left w:val="nil"/>
@@ -361,7 +361,7 @@
         </w:trPr>
         <w:tc>
           <w:tcPr>
-            <w:tcW w:w="582" w:type="dxa"/>
+            <w:tcW w:w="593" w:type="dxa"/>
             <w:tcBorders>
               <w:top w:val="nil"/>
               <w:left w:val="single" w:sz="4" w:space="0" w:color="auto"/>
@@ -376,126 +376,6 @@
               <w:spacing w:after="0" w:line="240" w:lineRule="auto"/>
               <w:jc w:val="right"/>
               <w:rPr>
-                <w:rFonts w:asciiTheme="majorHAnsi" w:eastAsia="Times New Roman" w:hAnsiTheme="majorHAnsi" w:cstheme="majorHAnsi"/>
-                <w:color w:val="000000"/>
-                <w:lang w:val="en-GB" w:eastAsia="zh-CN"/>
-              </w:rPr>
-            </w:pPr>
-            <w:r>
-              <w:rPr>
-                <w:rFonts w:asciiTheme="majorHAnsi" w:eastAsia="Times New Roman" w:hAnsiTheme="majorHAnsi" w:cstheme="majorHAnsi"/>
-                <w:color w:val="000000"/>
-                <w:lang w:eastAsia="zh-CN"/>
-              </w:rPr>
-              <w:t>2</w:t>
-            </w:r>
-          </w:p>
-        </w:tc>
-        <w:tc>
-          <w:tcPr>
-            <w:tcW w:w="3568" w:type="dxa"/>
-            <w:tcBorders>
-              <w:top w:val="nil"/>
-              <w:left w:val="nil"/>
-              <w:bottom w:val="single" w:sz="4" w:space="0" w:color="auto"/>
-              <w:right w:val="single" w:sz="4" w:space="0" w:color="auto"/>
-            </w:tcBorders>
-            <w:vAlign w:val="center"/>
-          </w:tcPr>
-          <w:p>
-            <w:pPr>
-              <w:spacing w:after="0" w:line="240" w:lineRule="auto"/>
-              <w:rPr>
-                <w:rFonts w:asciiTheme="majorHAnsi" w:eastAsia="Times New Roman" w:hAnsiTheme="majorHAnsi" w:cstheme="majorHAnsi"/>
-                <w:color w:val="000000"/>
-                <w:lang w:val="en-GB" w:eastAsia="zh-CN"/>
-              </w:rPr>
-            </w:pPr>
-            <w:r>
-              <w:rPr>
-                <w:rFonts w:asciiTheme="majorHAnsi" w:eastAsia="Times New Roman" w:hAnsiTheme="majorHAnsi" w:cstheme="majorHAnsi"/>
-                <w:color w:val="000000"/>
-                <w:lang w:val="en-GB" w:eastAsia="zh-CN"/>
-              </w:rPr>
-              <w:t>BST stores data grouped by year</w:t>
-            </w:r>
-          </w:p>
-        </w:tc>
-        <w:tc>
-          <w:tcPr>
-            <w:tcW w:w="2839" w:type="dxa"/>
-            <w:tcBorders>
-              <w:top w:val="nil"/>
-              <w:left w:val="nil"/>
-              <w:bottom w:val="single" w:sz="4" w:space="0" w:color="auto"/>
-              <w:right w:val="single" w:sz="4" w:space="0" w:color="auto"/>
-            </w:tcBorders>
-            <w:vAlign w:val="center"/>
-          </w:tcPr>
-          <w:p>
-            <w:pPr>
-              <w:spacing w:after="0" w:line="240" w:lineRule="auto"/>
-              <w:rPr>
-                <w:rFonts w:asciiTheme="majorHAnsi" w:eastAsia="Times New Roman" w:hAnsiTheme="majorHAnsi" w:cstheme="majorHAnsi"/>
-                <w:color w:val="000000"/>
-                <w:lang w:val="en-GB" w:eastAsia="zh-CN"/>
-              </w:rPr>
-            </w:pPr>
-            <w:r>
-              <w:rPr>
-                <w:rFonts w:asciiTheme="majorHAnsi" w:eastAsia="Times New Roman" w:hAnsiTheme="majorHAnsi" w:cstheme="majorHAnsi"/>
-                <w:color w:val="000000"/>
-                <w:lang w:val="en-GB" w:eastAsia="zh-CN"/>
-              </w:rPr>
-              <w:t>Inspect store after load</w:t>
-            </w:r>
-          </w:p>
-        </w:tc>
-        <w:tc>
-          <w:tcPr>
-            <w:tcW w:w="3218" w:type="dxa"/>
-            <w:tcBorders>
-              <w:top w:val="nil"/>
-              <w:left w:val="nil"/>
-              <w:bottom w:val="single" w:sz="4" w:space="0" w:color="auto"/>
-              <w:right w:val="single" w:sz="4" w:space="0" w:color="auto"/>
-            </w:tcBorders>
-            <w:vAlign w:val="center"/>
-          </w:tcPr>
-          <w:p>
-            <w:pPr>
-              <w:spacing w:after="0" w:line="240" w:lineRule="auto"/>
-              <w:rPr>
-                <w:rFonts w:asciiTheme="majorHAnsi" w:eastAsia="Times New Roman" w:hAnsiTheme="majorHAnsi" w:cstheme="majorHAnsi"/>
-                <w:color w:val="000000"/>
-                <w:lang w:val="en-GB" w:eastAsia="zh-CN"/>
-              </w:rPr>
-            </w:pPr>
-            <w:r>
-              <w:rPr>
-                <w:rFonts w:asciiTheme="majorHAnsi" w:eastAsia="Times New Roman" w:hAnsiTheme="majorHAnsi" w:cstheme="majorHAnsi"/>
-                <w:color w:val="000000"/>
-                <w:lang w:val="en-GB" w:eastAsia="zh-CN"/>
-              </w:rPr>
-              <w:t>Records grouped under correct year nodes</w:t>
-            </w:r>
-          </w:p>
-        </w:tc>
-        <w:tc>
-          <w:tcPr>
-            <w:tcW w:w="833" w:type="dxa"/>
-            <w:tcBorders>
-              <w:top w:val="nil"/>
-              <w:left w:val="nil"/>
-              <w:bottom w:val="single" w:sz="4" w:space="0" w:color="auto"/>
-              <w:right w:val="single" w:sz="4" w:space="0" w:color="auto"/>
-            </w:tcBorders>
-            <w:vAlign w:val="center"/>
-          </w:tcPr>
-          <w:p>
-            <w:pPr>
-              <w:spacing w:after="0" w:line="240" w:lineRule="auto"/>
-              <w:rPr>
                 <w:rFonts w:asciiTheme="majorHAnsi" w:eastAsia="宋体" w:hAnsiTheme="majorHAnsi" w:cstheme="majorHAnsi" w:hint="eastAsia"/>
                 <w:color w:val="000000"/>
                 <w:lang w:val="en-GB" w:eastAsia="zh-CN"/>
@@ -507,50 +387,13 @@
                 <w:color w:val="000000"/>
                 <w:lang w:val="en-GB" w:eastAsia="zh-CN"/>
               </w:rPr>
-              <w:t>Pass</w:t>
-            </w:r>
-          </w:p>
-        </w:tc>
-      </w:tr>
-      <w:tr>
-        <w:trPr>
-          <w:trHeight w:val="288"/>
-        </w:trPr>
-        <w:tc>
-          <w:tcPr>
-            <w:tcW w:w="582" w:type="dxa"/>
-            <w:tcBorders>
-              <w:top w:val="nil"/>
-              <w:left w:val="single" w:sz="4" w:space="0" w:color="auto"/>
-              <w:bottom w:val="single" w:sz="4" w:space="0" w:color="auto"/>
-              <w:right w:val="single" w:sz="4" w:space="0" w:color="auto"/>
-            </w:tcBorders>
-            <w:vAlign w:val="center"/>
-            <w:hideMark/>
-          </w:tcPr>
-          <w:p>
-            <w:pPr>
-              <w:spacing w:after="0" w:line="240" w:lineRule="auto"/>
-              <w:jc w:val="right"/>
-              <w:rPr>
-                <w:rFonts w:asciiTheme="majorHAnsi" w:eastAsia="Times New Roman" w:hAnsiTheme="majorHAnsi" w:cstheme="majorHAnsi"/>
-                <w:color w:val="000000"/>
-                <w:lang w:val="en-GB" w:eastAsia="zh-CN"/>
-              </w:rPr>
-            </w:pPr>
-            <w:r>
-              <w:rPr>
-                <w:rFonts w:asciiTheme="majorHAnsi" w:eastAsia="Times New Roman" w:hAnsiTheme="majorHAnsi" w:cstheme="majorHAnsi"/>
-                <w:color w:val="000000"/>
-                <w:lang w:eastAsia="zh-CN"/>
-              </w:rPr>
-              <w:t>3</w:t>
+              <w:t>2</w:t>
             </w:r>
           </w:p>
         </w:tc>
         <w:tc>
           <w:tcPr>
-            <w:tcW w:w="3568" w:type="dxa"/>
+            <w:tcW w:w="3563" w:type="dxa"/>
             <w:tcBorders>
               <w:top w:val="nil"/>
               <w:left w:val="nil"/>
@@ -580,7 +423,7 @@
         </w:tc>
         <w:tc>
           <w:tcPr>
-            <w:tcW w:w="2839" w:type="dxa"/>
+            <w:tcW w:w="2836" w:type="dxa"/>
             <w:tcBorders>
               <w:top w:val="nil"/>
               <w:left w:val="nil"/>
@@ -610,7 +453,7 @@
         </w:tc>
         <w:tc>
           <w:tcPr>
-            <w:tcW w:w="3218" w:type="dxa"/>
+            <w:tcW w:w="3215" w:type="dxa"/>
             <w:tcBorders>
               <w:top w:val="nil"/>
               <w:left w:val="nil"/>
@@ -675,7 +518,7 @@
         </w:trPr>
         <w:tc>
           <w:tcPr>
-            <w:tcW w:w="582" w:type="dxa"/>
+            <w:tcW w:w="593" w:type="dxa"/>
             <w:tcBorders>
               <w:top w:val="nil"/>
               <w:left w:val="single" w:sz="4" w:space="0" w:color="auto"/>
@@ -690,24 +533,24 @@
               <w:spacing w:after="0" w:line="240" w:lineRule="auto"/>
               <w:jc w:val="right"/>
               <w:rPr>
-                <w:rFonts w:asciiTheme="majorHAnsi" w:eastAsia="Times New Roman" w:hAnsiTheme="majorHAnsi" w:cstheme="majorHAnsi"/>
+                <w:rFonts w:asciiTheme="majorHAnsi" w:eastAsia="宋体" w:hAnsiTheme="majorHAnsi" w:cstheme="majorHAnsi" w:hint="eastAsia"/>
                 <w:color w:val="000000"/>
                 <w:lang w:val="en-GB" w:eastAsia="zh-CN"/>
               </w:rPr>
             </w:pPr>
             <w:r>
               <w:rPr>
-                <w:rFonts w:asciiTheme="majorHAnsi" w:eastAsia="Times New Roman" w:hAnsiTheme="majorHAnsi" w:cstheme="majorHAnsi"/>
+                <w:rFonts w:asciiTheme="majorHAnsi" w:eastAsia="宋体" w:hAnsiTheme="majorHAnsi" w:cstheme="majorHAnsi" w:hint="eastAsia"/>
                 <w:color w:val="000000"/>
-                <w:lang w:eastAsia="zh-CN"/>
+                <w:lang w:val="en-GB" w:eastAsia="zh-CN"/>
               </w:rPr>
-              <w:t>4</w:t>
+              <w:t>3</w:t>
             </w:r>
           </w:p>
         </w:tc>
         <w:tc>
           <w:tcPr>
-            <w:tcW w:w="3568" w:type="dxa"/>
+            <w:tcW w:w="3563" w:type="dxa"/>
             <w:tcBorders>
               <w:top w:val="nil"/>
               <w:left w:val="nil"/>
@@ -737,7 +580,7 @@
         </w:tc>
         <w:tc>
           <w:tcPr>
-            <w:tcW w:w="2839" w:type="dxa"/>
+            <w:tcW w:w="2836" w:type="dxa"/>
             <w:tcBorders>
               <w:top w:val="nil"/>
               <w:left w:val="nil"/>
@@ -767,7 +610,7 @@
         </w:tc>
         <w:tc>
           <w:tcPr>
-            <w:tcW w:w="3218" w:type="dxa"/>
+            <w:tcW w:w="3215" w:type="dxa"/>
             <w:tcBorders>
               <w:top w:val="nil"/>
               <w:left w:val="nil"/>
@@ -832,7 +675,7 @@
         </w:trPr>
         <w:tc>
           <w:tcPr>
-            <w:tcW w:w="582" w:type="dxa"/>
+            <w:tcW w:w="593" w:type="dxa"/>
             <w:tcBorders>
               <w:top w:val="nil"/>
               <w:left w:val="single" w:sz="4" w:space="0" w:color="auto"/>
@@ -847,24 +690,24 @@
               <w:spacing w:after="0" w:line="240" w:lineRule="auto"/>
               <w:jc w:val="right"/>
               <w:rPr>
-                <w:rFonts w:asciiTheme="majorHAnsi" w:eastAsia="Times New Roman" w:hAnsiTheme="majorHAnsi" w:cstheme="majorHAnsi"/>
+                <w:rFonts w:asciiTheme="majorHAnsi" w:eastAsia="宋体" w:hAnsiTheme="majorHAnsi" w:cstheme="majorHAnsi" w:hint="eastAsia"/>
                 <w:color w:val="000000"/>
                 <w:lang w:val="en-GB" w:eastAsia="zh-CN"/>
               </w:rPr>
             </w:pPr>
             <w:r>
               <w:rPr>
-                <w:rFonts w:asciiTheme="majorHAnsi" w:eastAsia="Times New Roman" w:hAnsiTheme="majorHAnsi" w:cstheme="majorHAnsi"/>
+                <w:rFonts w:asciiTheme="majorHAnsi" w:eastAsia="宋体" w:hAnsiTheme="majorHAnsi" w:cstheme="majorHAnsi" w:hint="eastAsia"/>
                 <w:color w:val="000000"/>
-                <w:lang w:eastAsia="zh-CN"/>
+                <w:lang w:val="en-GB" w:eastAsia="zh-CN"/>
               </w:rPr>
-              <w:t>5</w:t>
+              <w:t>4</w:t>
             </w:r>
           </w:p>
         </w:tc>
         <w:tc>
           <w:tcPr>
-            <w:tcW w:w="3568" w:type="dxa"/>
+            <w:tcW w:w="3563" w:type="dxa"/>
             <w:tcBorders>
               <w:top w:val="nil"/>
               <w:left w:val="nil"/>
@@ -894,7 +737,7 @@
         </w:tc>
         <w:tc>
           <w:tcPr>
-            <w:tcW w:w="2839" w:type="dxa"/>
+            <w:tcW w:w="2836" w:type="dxa"/>
             <w:tcBorders>
               <w:top w:val="nil"/>
               <w:left w:val="nil"/>
@@ -924,7 +767,7 @@
         </w:tc>
         <w:tc>
           <w:tcPr>
-            <w:tcW w:w="3218" w:type="dxa"/>
+            <w:tcW w:w="3215" w:type="dxa"/>
             <w:tcBorders>
               <w:top w:val="nil"/>
               <w:left w:val="nil"/>
@@ -989,7 +832,7 @@
         </w:trPr>
         <w:tc>
           <w:tcPr>
-            <w:tcW w:w="582" w:type="dxa"/>
+            <w:tcW w:w="593" w:type="dxa"/>
             <w:tcBorders>
               <w:top w:val="nil"/>
               <w:left w:val="single" w:sz="4" w:space="0" w:color="auto"/>
@@ -1004,24 +847,24 @@
               <w:spacing w:after="0" w:line="240" w:lineRule="auto"/>
               <w:jc w:val="right"/>
               <w:rPr>
-                <w:rFonts w:asciiTheme="majorHAnsi" w:eastAsia="Times New Roman" w:hAnsiTheme="majorHAnsi" w:cstheme="majorHAnsi"/>
+                <w:rFonts w:asciiTheme="majorHAnsi" w:eastAsia="宋体" w:hAnsiTheme="majorHAnsi" w:cstheme="majorHAnsi" w:hint="eastAsia"/>
                 <w:color w:val="000000"/>
                 <w:lang w:val="en-GB" w:eastAsia="zh-CN"/>
               </w:rPr>
             </w:pPr>
             <w:r>
               <w:rPr>
-                <w:rFonts w:asciiTheme="majorHAnsi" w:eastAsia="Times New Roman" w:hAnsiTheme="majorHAnsi" w:cstheme="majorHAnsi"/>
+                <w:rFonts w:asciiTheme="majorHAnsi" w:eastAsia="宋体" w:hAnsiTheme="majorHAnsi" w:cstheme="majorHAnsi" w:hint="eastAsia"/>
                 <w:color w:val="000000"/>
-                <w:lang w:eastAsia="zh-CN"/>
+                <w:lang w:val="en-GB" w:eastAsia="zh-CN"/>
               </w:rPr>
-              <w:t>6</w:t>
+              <w:t>5</w:t>
             </w:r>
           </w:p>
         </w:tc>
         <w:tc>
           <w:tcPr>
-            <w:tcW w:w="3568" w:type="dxa"/>
+            <w:tcW w:w="3563" w:type="dxa"/>
             <w:tcBorders>
               <w:top w:val="nil"/>
               <w:left w:val="nil"/>
@@ -1051,7 +894,7 @@
         </w:tc>
         <w:tc>
           <w:tcPr>
-            <w:tcW w:w="2839" w:type="dxa"/>
+            <w:tcW w:w="2836" w:type="dxa"/>
             <w:tcBorders>
               <w:top w:val="nil"/>
               <w:left w:val="nil"/>
@@ -1081,7 +924,7 @@
         </w:tc>
         <w:tc>
           <w:tcPr>
-            <w:tcW w:w="3218" w:type="dxa"/>
+            <w:tcW w:w="3215" w:type="dxa"/>
             <w:tcBorders>
               <w:top w:val="nil"/>
               <w:left w:val="nil"/>
@@ -1146,7 +989,7 @@
         </w:trPr>
         <w:tc>
           <w:tcPr>
-            <w:tcW w:w="582" w:type="dxa"/>
+            <w:tcW w:w="593" w:type="dxa"/>
             <w:tcBorders>
               <w:top w:val="nil"/>
               <w:left w:val="single" w:sz="4" w:space="0" w:color="auto"/>
@@ -1161,24 +1004,24 @@
               <w:spacing w:after="0" w:line="240" w:lineRule="auto"/>
               <w:jc w:val="right"/>
               <w:rPr>
-                <w:rFonts w:asciiTheme="majorHAnsi" w:eastAsia="Times New Roman" w:hAnsiTheme="majorHAnsi" w:cstheme="majorHAnsi"/>
+                <w:rFonts w:asciiTheme="majorHAnsi" w:eastAsia="宋体" w:hAnsiTheme="majorHAnsi" w:cstheme="majorHAnsi" w:hint="eastAsia"/>
                 <w:color w:val="000000"/>
                 <w:lang w:val="en-GB" w:eastAsia="zh-CN"/>
               </w:rPr>
             </w:pPr>
             <w:r>
               <w:rPr>
-                <w:rFonts w:asciiTheme="majorHAnsi" w:eastAsia="Times New Roman" w:hAnsiTheme="majorHAnsi" w:cstheme="majorHAnsi"/>
+                <w:rFonts w:asciiTheme="majorHAnsi" w:eastAsia="宋体" w:hAnsiTheme="majorHAnsi" w:cstheme="majorHAnsi" w:hint="eastAsia"/>
                 <w:color w:val="000000"/>
-                <w:lang w:eastAsia="zh-CN"/>
+                <w:lang w:val="en-GB" w:eastAsia="zh-CN"/>
               </w:rPr>
-              <w:t>7</w:t>
+              <w:t>6</w:t>
             </w:r>
           </w:p>
         </w:tc>
         <w:tc>
           <w:tcPr>
-            <w:tcW w:w="3568" w:type="dxa"/>
+            <w:tcW w:w="3563" w:type="dxa"/>
             <w:tcBorders>
               <w:top w:val="nil"/>
               <w:left w:val="nil"/>
@@ -1208,7 +1051,7 @@
         </w:tc>
         <w:tc>
           <w:tcPr>
-            <w:tcW w:w="2839" w:type="dxa"/>
+            <w:tcW w:w="2836" w:type="dxa"/>
             <w:tcBorders>
               <w:top w:val="nil"/>
               <w:left w:val="nil"/>
@@ -1238,7 +1081,7 @@
         </w:tc>
         <w:tc>
           <w:tcPr>
-            <w:tcW w:w="3218" w:type="dxa"/>
+            <w:tcW w:w="3215" w:type="dxa"/>
             <w:tcBorders>
               <w:top w:val="nil"/>
               <w:left w:val="nil"/>
@@ -1303,7 +1146,7 @@
         </w:trPr>
         <w:tc>
           <w:tcPr>
-            <w:tcW w:w="582" w:type="dxa"/>
+            <w:tcW w:w="593" w:type="dxa"/>
             <w:tcBorders>
               <w:top w:val="nil"/>
               <w:left w:val="single" w:sz="4" w:space="0" w:color="auto"/>
@@ -1318,24 +1161,24 @@
               <w:spacing w:after="0" w:line="240" w:lineRule="auto"/>
               <w:jc w:val="right"/>
               <w:rPr>
-                <w:rFonts w:asciiTheme="majorHAnsi" w:eastAsia="Times New Roman" w:hAnsiTheme="majorHAnsi" w:cstheme="majorHAnsi"/>
+                <w:rFonts w:asciiTheme="majorHAnsi" w:eastAsia="宋体" w:hAnsiTheme="majorHAnsi" w:cstheme="majorHAnsi" w:hint="eastAsia"/>
                 <w:color w:val="000000"/>
                 <w:lang w:val="en-GB" w:eastAsia="zh-CN"/>
               </w:rPr>
             </w:pPr>
             <w:r>
               <w:rPr>
-                <w:rFonts w:asciiTheme="majorHAnsi" w:eastAsia="Times New Roman" w:hAnsiTheme="majorHAnsi" w:cstheme="majorHAnsi"/>
+                <w:rFonts w:asciiTheme="majorHAnsi" w:eastAsia="宋体" w:hAnsiTheme="majorHAnsi" w:cstheme="majorHAnsi" w:hint="eastAsia"/>
                 <w:color w:val="000000"/>
-                <w:lang w:eastAsia="zh-CN"/>
+                <w:lang w:val="en-GB" w:eastAsia="zh-CN"/>
               </w:rPr>
-              <w:t>8</w:t>
+              <w:t>7</w:t>
             </w:r>
           </w:p>
         </w:tc>
         <w:tc>
           <w:tcPr>
-            <w:tcW w:w="3568" w:type="dxa"/>
+            <w:tcW w:w="3563" w:type="dxa"/>
             <w:tcBorders>
               <w:top w:val="nil"/>
               <w:left w:val="nil"/>
@@ -1365,7 +1208,7 @@
         </w:tc>
         <w:tc>
           <w:tcPr>
-            <w:tcW w:w="2839" w:type="dxa"/>
+            <w:tcW w:w="2836" w:type="dxa"/>
             <w:tcBorders>
               <w:top w:val="nil"/>
               <w:left w:val="nil"/>
@@ -1395,7 +1238,7 @@
         </w:tc>
         <w:tc>
           <w:tcPr>
-            <w:tcW w:w="3218" w:type="dxa"/>
+            <w:tcW w:w="3215" w:type="dxa"/>
             <w:tcBorders>
               <w:top w:val="nil"/>
               <w:left w:val="nil"/>
@@ -1460,7 +1303,7 @@
         </w:trPr>
         <w:tc>
           <w:tcPr>
-            <w:tcW w:w="582" w:type="dxa"/>
+            <w:tcW w:w="593" w:type="dxa"/>
             <w:tcBorders>
               <w:top w:val="nil"/>
               <w:left w:val="single" w:sz="4" w:space="0" w:color="auto"/>
@@ -1475,24 +1318,24 @@
               <w:spacing w:after="0" w:line="240" w:lineRule="auto"/>
               <w:jc w:val="right"/>
               <w:rPr>
-                <w:rFonts w:asciiTheme="majorHAnsi" w:eastAsia="Times New Roman" w:hAnsiTheme="majorHAnsi" w:cstheme="majorHAnsi"/>
+                <w:rFonts w:asciiTheme="majorHAnsi" w:eastAsia="宋体" w:hAnsiTheme="majorHAnsi" w:cstheme="majorHAnsi" w:hint="eastAsia"/>
                 <w:color w:val="000000"/>
                 <w:lang w:val="en-GB" w:eastAsia="zh-CN"/>
               </w:rPr>
             </w:pPr>
             <w:r>
               <w:rPr>
-                <w:rFonts w:asciiTheme="majorHAnsi" w:eastAsia="Times New Roman" w:hAnsiTheme="majorHAnsi" w:cstheme="majorHAnsi"/>
+                <w:rFonts w:asciiTheme="majorHAnsi" w:eastAsia="宋体" w:hAnsiTheme="majorHAnsi" w:cstheme="majorHAnsi" w:hint="eastAsia"/>
                 <w:color w:val="000000"/>
-                <w:lang w:eastAsia="zh-CN"/>
+                <w:lang w:val="en-GB" w:eastAsia="zh-CN"/>
               </w:rPr>
-              <w:t>9</w:t>
+              <w:t>8</w:t>
             </w:r>
           </w:p>
         </w:tc>
         <w:tc>
           <w:tcPr>
-            <w:tcW w:w="3568" w:type="dxa"/>
+            <w:tcW w:w="3563" w:type="dxa"/>
             <w:tcBorders>
               <w:top w:val="nil"/>
               <w:left w:val="nil"/>
@@ -1522,7 +1365,7 @@
         </w:tc>
         <w:tc>
           <w:tcPr>
-            <w:tcW w:w="2839" w:type="dxa"/>
+            <w:tcW w:w="2836" w:type="dxa"/>
             <w:tcBorders>
               <w:top w:val="nil"/>
               <w:left w:val="nil"/>
@@ -1552,7 +1395,7 @@
         </w:tc>
         <w:tc>
           <w:tcPr>
-            <w:tcW w:w="3218" w:type="dxa"/>
+            <w:tcW w:w="3215" w:type="dxa"/>
             <w:tcBorders>
               <w:top w:val="nil"/>
               <w:left w:val="nil"/>
@@ -1617,7 +1460,7 @@
         </w:trPr>
         <w:tc>
           <w:tcPr>
-            <w:tcW w:w="582" w:type="dxa"/>
+            <w:tcW w:w="593" w:type="dxa"/>
             <w:tcBorders>
               <w:top w:val="nil"/>
               <w:left w:val="single" w:sz="4" w:space="0" w:color="auto"/>
@@ -1632,24 +1475,24 @@
               <w:spacing w:after="0" w:line="240" w:lineRule="auto"/>
               <w:jc w:val="right"/>
               <w:rPr>
-                <w:rFonts w:asciiTheme="majorHAnsi" w:eastAsia="Times New Roman" w:hAnsiTheme="majorHAnsi" w:cstheme="majorHAnsi"/>
+                <w:rFonts w:asciiTheme="majorHAnsi" w:eastAsia="宋体" w:hAnsiTheme="majorHAnsi" w:cstheme="majorHAnsi" w:hint="eastAsia"/>
                 <w:color w:val="000000"/>
                 <w:lang w:val="en-GB" w:eastAsia="zh-CN"/>
               </w:rPr>
             </w:pPr>
             <w:r>
               <w:rPr>
-                <w:rFonts w:asciiTheme="majorHAnsi" w:eastAsia="Times New Roman" w:hAnsiTheme="majorHAnsi" w:cstheme="majorHAnsi"/>
+                <w:rFonts w:asciiTheme="majorHAnsi" w:eastAsia="宋体" w:hAnsiTheme="majorHAnsi" w:cstheme="majorHAnsi" w:hint="eastAsia"/>
                 <w:color w:val="000000"/>
-                <w:lang w:eastAsia="zh-CN"/>
+                <w:lang w:val="en-GB" w:eastAsia="zh-CN"/>
               </w:rPr>
-              <w:t>10</w:t>
+              <w:t>9</w:t>
             </w:r>
           </w:p>
         </w:tc>
         <w:tc>
           <w:tcPr>
-            <w:tcW w:w="3568" w:type="dxa"/>
+            <w:tcW w:w="3563" w:type="dxa"/>
             <w:tcBorders>
               <w:top w:val="nil"/>
               <w:left w:val="nil"/>
@@ -1679,7 +1522,7 @@
         </w:tc>
         <w:tc>
           <w:tcPr>
-            <w:tcW w:w="2839" w:type="dxa"/>
+            <w:tcW w:w="2836" w:type="dxa"/>
             <w:tcBorders>
               <w:top w:val="nil"/>
               <w:left w:val="nil"/>
@@ -1709,7 +1552,7 @@
         </w:tc>
         <w:tc>
           <w:tcPr>
-            <w:tcW w:w="3218" w:type="dxa"/>
+            <w:tcW w:w="3215" w:type="dxa"/>
             <w:tcBorders>
               <w:top w:val="nil"/>
               <w:left w:val="nil"/>
@@ -1774,7 +1617,7 @@
         </w:trPr>
         <w:tc>
           <w:tcPr>
-            <w:tcW w:w="582" w:type="dxa"/>
+            <w:tcW w:w="593" w:type="dxa"/>
             <w:tcBorders>
               <w:top w:val="nil"/>
               <w:left w:val="single" w:sz="4" w:space="0" w:color="auto"/>
@@ -1789,7 +1632,7 @@
               <w:spacing w:after="0" w:line="240" w:lineRule="auto"/>
               <w:jc w:val="right"/>
               <w:rPr>
-                <w:rFonts w:asciiTheme="majorHAnsi" w:eastAsia="Times New Roman" w:hAnsiTheme="majorHAnsi" w:cstheme="majorHAnsi"/>
+                <w:rFonts w:asciiTheme="majorHAnsi" w:eastAsia="宋体" w:hAnsiTheme="majorHAnsi" w:cstheme="majorHAnsi" w:hint="eastAsia"/>
                 <w:color w:val="000000"/>
                 <w:lang w:val="en-GB" w:eastAsia="zh-CN"/>
               </w:rPr>
@@ -1800,13 +1643,21 @@
                 <w:color w:val="000000"/>
                 <w:lang w:eastAsia="zh-CN"/>
               </w:rPr>
-              <w:t>11</w:t>
+              <w:t>1</w:t>
+            </w:r>
+            <w:r>
+              <w:rPr>
+                <w:rFonts w:asciiTheme="majorHAnsi" w:eastAsia="宋体" w:hAnsiTheme="majorHAnsi" w:cstheme="majorHAnsi" w:hint="eastAsia"/>
+                <w:color w:val="000000"/>
+                <w:lang w:eastAsia="zh-CN"/>
+              </w:rPr>
+              <w:t>0</w:t>
             </w:r>
           </w:p>
         </w:tc>
         <w:tc>
           <w:tcPr>
-            <w:tcW w:w="3568" w:type="dxa"/>
+            <w:tcW w:w="3563" w:type="dxa"/>
             <w:tcBorders>
               <w:top w:val="nil"/>
               <w:left w:val="nil"/>
@@ -1836,7 +1687,7 @@
         </w:tc>
         <w:tc>
           <w:tcPr>
-            <w:tcW w:w="2839" w:type="dxa"/>
+            <w:tcW w:w="2836" w:type="dxa"/>
             <w:tcBorders>
               <w:top w:val="nil"/>
               <w:left w:val="nil"/>
@@ -1866,7 +1717,7 @@
         </w:tc>
         <w:tc>
           <w:tcPr>
-            <w:tcW w:w="3218" w:type="dxa"/>
+            <w:tcW w:w="3215" w:type="dxa"/>
             <w:tcBorders>
               <w:top w:val="nil"/>
               <w:left w:val="nil"/>
@@ -1931,7 +1782,7 @@
         </w:trPr>
         <w:tc>
           <w:tcPr>
-            <w:tcW w:w="582" w:type="dxa"/>
+            <w:tcW w:w="593" w:type="dxa"/>
             <w:tcBorders>
               <w:top w:val="nil"/>
               <w:left w:val="single" w:sz="4" w:space="0" w:color="auto"/>
@@ -1946,7 +1797,7 @@
               <w:spacing w:after="0" w:line="240" w:lineRule="auto"/>
               <w:jc w:val="right"/>
               <w:rPr>
-                <w:rFonts w:asciiTheme="majorHAnsi" w:eastAsia="Times New Roman" w:hAnsiTheme="majorHAnsi" w:cstheme="majorHAnsi"/>
+                <w:rFonts w:asciiTheme="majorHAnsi" w:eastAsia="宋体" w:hAnsiTheme="majorHAnsi" w:cstheme="majorHAnsi" w:hint="eastAsia"/>
                 <w:color w:val="000000"/>
                 <w:lang w:val="en-GB" w:eastAsia="zh-CN"/>
               </w:rPr>
@@ -1957,13 +1808,21 @@
                 <w:color w:val="000000"/>
                 <w:lang w:eastAsia="zh-CN"/>
               </w:rPr>
-              <w:t>12</w:t>
+              <w:t>1</w:t>
+            </w:r>
+            <w:r>
+              <w:rPr>
+                <w:rFonts w:asciiTheme="majorHAnsi" w:eastAsia="宋体" w:hAnsiTheme="majorHAnsi" w:cstheme="majorHAnsi" w:hint="eastAsia"/>
+                <w:color w:val="000000"/>
+                <w:lang w:eastAsia="zh-CN"/>
+              </w:rPr>
+              <w:t>1</w:t>
             </w:r>
           </w:p>
         </w:tc>
         <w:tc>
           <w:tcPr>
-            <w:tcW w:w="3568" w:type="dxa"/>
+            <w:tcW w:w="3563" w:type="dxa"/>
             <w:tcBorders>
               <w:top w:val="nil"/>
               <w:left w:val="nil"/>
@@ -1993,7 +1852,7 @@
         </w:tc>
         <w:tc>
           <w:tcPr>
-            <w:tcW w:w="2839" w:type="dxa"/>
+            <w:tcW w:w="2836" w:type="dxa"/>
             <w:tcBorders>
               <w:top w:val="nil"/>
               <w:left w:val="nil"/>
@@ -2023,7 +1882,7 @@
         </w:tc>
         <w:tc>
           <w:tcPr>
-            <w:tcW w:w="3218" w:type="dxa"/>
+            <w:tcW w:w="3215" w:type="dxa"/>
             <w:tcBorders>
               <w:top w:val="nil"/>
               <w:left w:val="nil"/>
@@ -2088,7 +1947,7 @@
         </w:trPr>
         <w:tc>
           <w:tcPr>
-            <w:tcW w:w="582" w:type="dxa"/>
+            <w:tcW w:w="593" w:type="dxa"/>
             <w:tcBorders>
               <w:top w:val="nil"/>
               <w:left w:val="single" w:sz="4" w:space="0" w:color="auto"/>
@@ -2103,7 +1962,7 @@
               <w:spacing w:after="0" w:line="240" w:lineRule="auto"/>
               <w:jc w:val="right"/>
               <w:rPr>
-                <w:rFonts w:asciiTheme="majorHAnsi" w:eastAsia="Times New Roman" w:hAnsiTheme="majorHAnsi" w:cstheme="majorHAnsi"/>
+                <w:rFonts w:asciiTheme="majorHAnsi" w:eastAsia="宋体" w:hAnsiTheme="majorHAnsi" w:cstheme="majorHAnsi" w:hint="eastAsia"/>
                 <w:color w:val="000000"/>
                 <w:lang w:val="en-GB" w:eastAsia="zh-CN"/>
               </w:rPr>
@@ -2114,13 +1973,21 @@
                 <w:color w:val="000000"/>
                 <w:lang w:eastAsia="zh-CN"/>
               </w:rPr>
-              <w:t>13</w:t>
+              <w:t>1</w:t>
+            </w:r>
+            <w:r>
+              <w:rPr>
+                <w:rFonts w:asciiTheme="majorHAnsi" w:eastAsia="宋体" w:hAnsiTheme="majorHAnsi" w:cstheme="majorHAnsi" w:hint="eastAsia"/>
+                <w:color w:val="000000"/>
+                <w:lang w:eastAsia="zh-CN"/>
+              </w:rPr>
+              <w:t>2</w:t>
             </w:r>
           </w:p>
         </w:tc>
         <w:tc>
           <w:tcPr>
-            <w:tcW w:w="3568" w:type="dxa"/>
+            <w:tcW w:w="3563" w:type="dxa"/>
             <w:tcBorders>
               <w:top w:val="nil"/>
               <w:left w:val="nil"/>
@@ -2150,7 +2017,7 @@
         </w:tc>
         <w:tc>
           <w:tcPr>
-            <w:tcW w:w="2839" w:type="dxa"/>
+            <w:tcW w:w="2836" w:type="dxa"/>
             <w:tcBorders>
               <w:top w:val="nil"/>
               <w:left w:val="nil"/>
@@ -2180,7 +2047,7 @@
         </w:tc>
         <w:tc>
           <w:tcPr>
-            <w:tcW w:w="3218" w:type="dxa"/>
+            <w:tcW w:w="3215" w:type="dxa"/>
             <w:tcBorders>
               <w:top w:val="nil"/>
               <w:left w:val="nil"/>
@@ -2245,7 +2112,7 @@
         </w:trPr>
         <w:tc>
           <w:tcPr>
-            <w:tcW w:w="582" w:type="dxa"/>
+            <w:tcW w:w="593" w:type="dxa"/>
             <w:tcBorders>
               <w:top w:val="nil"/>
               <w:left w:val="single" w:sz="4" w:space="0" w:color="auto"/>
@@ -2260,7 +2127,7 @@
               <w:spacing w:after="0" w:line="240" w:lineRule="auto"/>
               <w:jc w:val="right"/>
               <w:rPr>
-                <w:rFonts w:asciiTheme="majorHAnsi" w:eastAsia="Times New Roman" w:hAnsiTheme="majorHAnsi" w:cstheme="majorHAnsi"/>
+                <w:rFonts w:asciiTheme="majorHAnsi" w:eastAsia="宋体" w:hAnsiTheme="majorHAnsi" w:cstheme="majorHAnsi" w:hint="eastAsia"/>
                 <w:color w:val="000000"/>
                 <w:lang w:val="en-GB" w:eastAsia="zh-CN"/>
               </w:rPr>
@@ -2271,13 +2138,21 @@
                 <w:color w:val="000000"/>
                 <w:lang w:eastAsia="zh-CN"/>
               </w:rPr>
-              <w:t>14</w:t>
+              <w:t>1</w:t>
+            </w:r>
+            <w:r>
+              <w:rPr>
+                <w:rFonts w:asciiTheme="majorHAnsi" w:eastAsia="宋体" w:hAnsiTheme="majorHAnsi" w:cstheme="majorHAnsi" w:hint="eastAsia"/>
+                <w:color w:val="000000"/>
+                <w:lang w:eastAsia="zh-CN"/>
+              </w:rPr>
+              <w:t>3</w:t>
             </w:r>
           </w:p>
         </w:tc>
         <w:tc>
           <w:tcPr>
-            <w:tcW w:w="3568" w:type="dxa"/>
+            <w:tcW w:w="3563" w:type="dxa"/>
             <w:tcBorders>
               <w:top w:val="nil"/>
               <w:left w:val="nil"/>
@@ -2307,7 +2182,7 @@
         </w:tc>
         <w:tc>
           <w:tcPr>
-            <w:tcW w:w="2839" w:type="dxa"/>
+            <w:tcW w:w="2836" w:type="dxa"/>
             <w:tcBorders>
               <w:top w:val="nil"/>
               <w:left w:val="nil"/>
@@ -2337,7 +2212,7 @@
         </w:tc>
         <w:tc>
           <w:tcPr>
-            <w:tcW w:w="3218" w:type="dxa"/>
+            <w:tcW w:w="3215" w:type="dxa"/>
             <w:tcBorders>
               <w:top w:val="nil"/>
               <w:left w:val="nil"/>
@@ -2402,7 +2277,7 @@
         </w:trPr>
         <w:tc>
           <w:tcPr>
-            <w:tcW w:w="582" w:type="dxa"/>
+            <w:tcW w:w="593" w:type="dxa"/>
             <w:tcBorders>
               <w:top w:val="nil"/>
               <w:left w:val="single" w:sz="4" w:space="0" w:color="auto"/>
@@ -2417,7 +2292,7 @@
               <w:spacing w:after="0" w:line="240" w:lineRule="auto"/>
               <w:jc w:val="right"/>
               <w:rPr>
-                <w:rFonts w:asciiTheme="majorHAnsi" w:eastAsia="Times New Roman" w:hAnsiTheme="majorHAnsi" w:cstheme="majorHAnsi"/>
+                <w:rFonts w:asciiTheme="majorHAnsi" w:eastAsia="宋体" w:hAnsiTheme="majorHAnsi" w:cstheme="majorHAnsi" w:hint="eastAsia"/>
                 <w:color w:val="000000"/>
                 <w:lang w:val="en-GB" w:eastAsia="zh-CN"/>
               </w:rPr>
@@ -2428,13 +2303,21 @@
                 <w:color w:val="000000"/>
                 <w:lang w:eastAsia="zh-CN"/>
               </w:rPr>
-              <w:t>15</w:t>
+              <w:t>1</w:t>
+            </w:r>
+            <w:r>
+              <w:rPr>
+                <w:rFonts w:asciiTheme="majorHAnsi" w:eastAsia="宋体" w:hAnsiTheme="majorHAnsi" w:cstheme="majorHAnsi" w:hint="eastAsia"/>
+                <w:color w:val="000000"/>
+                <w:lang w:eastAsia="zh-CN"/>
+              </w:rPr>
+              <w:t>4</w:t>
             </w:r>
           </w:p>
         </w:tc>
         <w:tc>
           <w:tcPr>
-            <w:tcW w:w="3568" w:type="dxa"/>
+            <w:tcW w:w="3563" w:type="dxa"/>
             <w:tcBorders>
               <w:top w:val="nil"/>
               <w:left w:val="nil"/>
@@ -2472,7 +2355,7 @@
         </w:tc>
         <w:tc>
           <w:tcPr>
-            <w:tcW w:w="2839" w:type="dxa"/>
+            <w:tcW w:w="2836" w:type="dxa"/>
             <w:tcBorders>
               <w:top w:val="nil"/>
               <w:left w:val="nil"/>
@@ -2502,7 +2385,7 @@
         </w:tc>
         <w:tc>
           <w:tcPr>
-            <w:tcW w:w="3218" w:type="dxa"/>
+            <w:tcW w:w="3215" w:type="dxa"/>
             <w:tcBorders>
               <w:top w:val="nil"/>
               <w:left w:val="nil"/>
@@ -2595,14 +2478,13 @@
       <w:r>
         <w:rPr>
           <w:rFonts w:asciiTheme="majorHAnsi" w:hAnsiTheme="majorHAnsi" w:cstheme="majorHAnsi"/>
-          <w:noProof/>
           <w:lang w:val="en-GB"/>
         </w:rPr>
         <w:drawing>
-          <wp:inline distT="0" distB="0" distL="0" distR="0" wp14:anchorId="1C777AAC" wp14:editId="2EA9EAE8">
-            <wp:extent cx="7097115" cy="3010320"/>
-            <wp:effectExtent l="0" t="0" r="8890" b="0"/>
-            <wp:docPr id="813198620" name="Picture 1"/>
+          <wp:inline distT="0" distB="0" distL="0" distR="0" wp14:anchorId="636209C7" wp14:editId="57E6C8A3">
+            <wp:extent cx="8229600" cy="4218940"/>
+            <wp:effectExtent l="0" t="0" r="0" b="0"/>
+            <wp:docPr id="1731804804" name="Picture 1"/>
             <wp:cNvGraphicFramePr>
               <a:graphicFrameLocks xmlns:a="http://schemas.openxmlformats.org/drawingml/2006/main" noChangeAspect="1"/>
             </wp:cNvGraphicFramePr>
@@ -2610,7 +2492,7 @@
               <a:graphicData uri="http://schemas.openxmlformats.org/drawingml/2006/picture">
                 <pic:pic xmlns:pic="http://schemas.openxmlformats.org/drawingml/2006/picture">
                   <pic:nvPicPr>
-                    <pic:cNvPr id="813198620" name=""/>
+                    <pic:cNvPr id="1731804804" name=""/>
                     <pic:cNvPicPr/>
                   </pic:nvPicPr>
                   <pic:blipFill>
@@ -2622,7 +2504,7 @@
                   <pic:spPr>
                     <a:xfrm>
                       <a:off x="0" y="0"/>
-                      <a:ext cx="7097115" cy="3010320"/>
+                      <a:ext cx="8229600" cy="4218940"/>
                     </a:xfrm>
                     <a:prstGeom prst="rect">
                       <a:avLst/>
@@ -2676,14 +2558,13 @@
       <w:r>
         <w:rPr>
           <w:rFonts w:asciiTheme="majorHAnsi" w:hAnsiTheme="majorHAnsi" w:cstheme="majorHAnsi"/>
-          <w:noProof/>
           <w:lang w:val="en-GB"/>
         </w:rPr>
         <w:drawing>
-          <wp:inline distT="0" distB="0" distL="0" distR="0" wp14:anchorId="336D71E3" wp14:editId="08B6E8AF">
-            <wp:extent cx="7125694" cy="3105583"/>
+          <wp:inline distT="0" distB="0" distL="0" distR="0" wp14:anchorId="580D1DB5" wp14:editId="46D62025">
+            <wp:extent cx="8229600" cy="3524885"/>
             <wp:effectExtent l="0" t="0" r="0" b="0"/>
-            <wp:docPr id="751779949" name="Picture 1"/>
+            <wp:docPr id="31271340" name="Picture 1"/>
             <wp:cNvGraphicFramePr>
               <a:graphicFrameLocks xmlns:a="http://schemas.openxmlformats.org/drawingml/2006/main" noChangeAspect="1"/>
             </wp:cNvGraphicFramePr>
@@ -2691,7 +2572,7 @@
               <a:graphicData uri="http://schemas.openxmlformats.org/drawingml/2006/picture">
                 <pic:pic xmlns:pic="http://schemas.openxmlformats.org/drawingml/2006/picture">
                   <pic:nvPicPr>
-                    <pic:cNvPr id="751779949" name=""/>
+                    <pic:cNvPr id="31271340" name=""/>
                     <pic:cNvPicPr/>
                   </pic:nvPicPr>
                   <pic:blipFill>
@@ -2703,7 +2584,7 @@
                   <pic:spPr>
                     <a:xfrm>
                       <a:off x="0" y="0"/>
-                      <a:ext cx="7125694" cy="3105583"/>
+                      <a:ext cx="8229600" cy="3524885"/>
                     </a:xfrm>
                     <a:prstGeom prst="rect">
                       <a:avLst/>
@@ -2757,14 +2638,13 @@
       <w:r>
         <w:rPr>
           <w:rFonts w:asciiTheme="majorHAnsi" w:hAnsiTheme="majorHAnsi" w:cstheme="majorHAnsi"/>
-          <w:noProof/>
           <w:lang w:val="en-GB"/>
         </w:rPr>
         <w:drawing>
-          <wp:inline distT="0" distB="0" distL="0" distR="0" wp14:anchorId="3481E979" wp14:editId="001852C4">
-            <wp:extent cx="8229600" cy="2731135"/>
-            <wp:effectExtent l="0" t="0" r="0" b="0"/>
-            <wp:docPr id="2103666132" name="Picture 1"/>
+          <wp:inline distT="0" distB="0" distL="0" distR="0" wp14:anchorId="4A383454" wp14:editId="1DFA6DC7">
+            <wp:extent cx="8229600" cy="4164330"/>
+            <wp:effectExtent l="0" t="0" r="0" b="7620"/>
+            <wp:docPr id="389764014" name="Picture 1"/>
             <wp:cNvGraphicFramePr>
               <a:graphicFrameLocks xmlns:a="http://schemas.openxmlformats.org/drawingml/2006/main" noChangeAspect="1"/>
             </wp:cNvGraphicFramePr>
@@ -2772,7 +2652,7 @@
               <a:graphicData uri="http://schemas.openxmlformats.org/drawingml/2006/picture">
                 <pic:pic xmlns:pic="http://schemas.openxmlformats.org/drawingml/2006/picture">
                   <pic:nvPicPr>
-                    <pic:cNvPr id="2103666132" name=""/>
+                    <pic:cNvPr id="389764014" name=""/>
                     <pic:cNvPicPr/>
                   </pic:nvPicPr>
                   <pic:blipFill>
@@ -2784,7 +2664,7 @@
                   <pic:spPr>
                     <a:xfrm>
                       <a:off x="0" y="0"/>
-                      <a:ext cx="8229600" cy="2731135"/>
+                      <a:ext cx="8229600" cy="4164330"/>
                     </a:xfrm>
                     <a:prstGeom prst="rect">
                       <a:avLst/>
@@ -2838,14 +2718,13 @@
       <w:r>
         <w:rPr>
           <w:rFonts w:asciiTheme="majorHAnsi" w:hAnsiTheme="majorHAnsi" w:cstheme="majorHAnsi"/>
-          <w:noProof/>
           <w:lang w:val="en-GB"/>
         </w:rPr>
         <w:drawing>
-          <wp:inline distT="0" distB="0" distL="0" distR="0" wp14:anchorId="1752A0CE" wp14:editId="62F7FA52">
-            <wp:extent cx="8229600" cy="2127885"/>
-            <wp:effectExtent l="0" t="0" r="0" b="5715"/>
-            <wp:docPr id="919605476" name="Picture 1"/>
+          <wp:inline distT="0" distB="0" distL="0" distR="0" wp14:anchorId="0158EECF" wp14:editId="63A377F5">
+            <wp:extent cx="8229600" cy="1985010"/>
+            <wp:effectExtent l="0" t="0" r="0" b="0"/>
+            <wp:docPr id="465240948" name="Picture 1"/>
             <wp:cNvGraphicFramePr>
               <a:graphicFrameLocks xmlns:a="http://schemas.openxmlformats.org/drawingml/2006/main" noChangeAspect="1"/>
             </wp:cNvGraphicFramePr>
@@ -2853,7 +2732,7 @@
               <a:graphicData uri="http://schemas.openxmlformats.org/drawingml/2006/picture">
                 <pic:pic xmlns:pic="http://schemas.openxmlformats.org/drawingml/2006/picture">
                   <pic:nvPicPr>
-                    <pic:cNvPr id="919605476" name=""/>
+                    <pic:cNvPr id="465240948" name=""/>
                     <pic:cNvPicPr/>
                   </pic:nvPicPr>
                   <pic:blipFill>
@@ -2865,7 +2744,7 @@
                   <pic:spPr>
                     <a:xfrm>
                       <a:off x="0" y="0"/>
-                      <a:ext cx="8229600" cy="2127885"/>
+                      <a:ext cx="8229600" cy="1985010"/>
                     </a:xfrm>
                     <a:prstGeom prst="rect">
                       <a:avLst/>
@@ -2918,14 +2797,13 @@
       <w:r>
         <w:rPr>
           <w:rFonts w:asciiTheme="majorHAnsi" w:hAnsiTheme="majorHAnsi" w:cstheme="majorHAnsi"/>
-          <w:noProof/>
           <w:lang w:val="en-GB"/>
         </w:rPr>
         <w:drawing>
-          <wp:inline distT="0" distB="0" distL="0" distR="0" wp14:anchorId="3FD01797" wp14:editId="2D25CAAE">
-            <wp:extent cx="7059010" cy="2848373"/>
-            <wp:effectExtent l="0" t="0" r="0" b="9525"/>
-            <wp:docPr id="839065542" name="Picture 1"/>
+          <wp:inline distT="0" distB="0" distL="0" distR="0" wp14:anchorId="069B1D26" wp14:editId="118063D3">
+            <wp:extent cx="8229600" cy="1849755"/>
+            <wp:effectExtent l="0" t="0" r="0" b="0"/>
+            <wp:docPr id="85942062" name="Picture 1"/>
             <wp:cNvGraphicFramePr>
               <a:graphicFrameLocks xmlns:a="http://schemas.openxmlformats.org/drawingml/2006/main" noChangeAspect="1"/>
             </wp:cNvGraphicFramePr>
@@ -2933,7 +2811,7 @@
               <a:graphicData uri="http://schemas.openxmlformats.org/drawingml/2006/picture">
                 <pic:pic xmlns:pic="http://schemas.openxmlformats.org/drawingml/2006/picture">
                   <pic:nvPicPr>
-                    <pic:cNvPr id="839065542" name=""/>
+                    <pic:cNvPr id="85942062" name=""/>
                     <pic:cNvPicPr/>
                   </pic:nvPicPr>
                   <pic:blipFill>
@@ -2945,7 +2823,7 @@
                   <pic:spPr>
                     <a:xfrm>
                       <a:off x="0" y="0"/>
-                      <a:ext cx="7059010" cy="2848373"/>
+                      <a:ext cx="8229600" cy="1849755"/>
                     </a:xfrm>
                     <a:prstGeom prst="rect">
                       <a:avLst/>
@@ -2999,14 +2877,13 @@
       <w:r>
         <w:rPr>
           <w:rFonts w:asciiTheme="majorHAnsi" w:hAnsiTheme="majorHAnsi" w:cstheme="majorHAnsi"/>
-          <w:noProof/>
           <w:lang w:val="en-GB"/>
         </w:rPr>
         <w:drawing>
-          <wp:inline distT="0" distB="0" distL="0" distR="0" wp14:anchorId="4838734A" wp14:editId="38ABB27A">
-            <wp:extent cx="7135221" cy="3191320"/>
-            <wp:effectExtent l="0" t="0" r="8890" b="9525"/>
-            <wp:docPr id="914863514" name="Picture 1"/>
+          <wp:inline distT="0" distB="0" distL="0" distR="0" wp14:anchorId="661484FC" wp14:editId="32891F3C">
+            <wp:extent cx="8229600" cy="2161540"/>
+            <wp:effectExtent l="0" t="0" r="0" b="0"/>
+            <wp:docPr id="1999302221" name="Picture 1"/>
             <wp:cNvGraphicFramePr>
               <a:graphicFrameLocks xmlns:a="http://schemas.openxmlformats.org/drawingml/2006/main" noChangeAspect="1"/>
             </wp:cNvGraphicFramePr>
@@ -3014,7 +2891,7 @@
               <a:graphicData uri="http://schemas.openxmlformats.org/drawingml/2006/picture">
                 <pic:pic xmlns:pic="http://schemas.openxmlformats.org/drawingml/2006/picture">
                   <pic:nvPicPr>
-                    <pic:cNvPr id="914863514" name=""/>
+                    <pic:cNvPr id="1999302221" name=""/>
                     <pic:cNvPicPr/>
                   </pic:nvPicPr>
                   <pic:blipFill>
@@ -3026,7 +2903,7 @@
                   <pic:spPr>
                     <a:xfrm>
                       <a:off x="0" y="0"/>
-                      <a:ext cx="7135221" cy="3191320"/>
+                      <a:ext cx="8229600" cy="2161540"/>
                     </a:xfrm>
                     <a:prstGeom prst="rect">
                       <a:avLst/>
@@ -3080,14 +2957,13 @@
       <w:r>
         <w:rPr>
           <w:rFonts w:asciiTheme="majorHAnsi" w:hAnsiTheme="majorHAnsi" w:cstheme="majorHAnsi"/>
-          <w:noProof/>
           <w:lang w:val="en-GB"/>
         </w:rPr>
         <w:drawing>
-          <wp:inline distT="0" distB="0" distL="0" distR="0" wp14:anchorId="5E19B12E" wp14:editId="1AAF2900">
-            <wp:extent cx="7125694" cy="3610479"/>
-            <wp:effectExtent l="0" t="0" r="0" b="9525"/>
-            <wp:docPr id="1998037273" name="Picture 1"/>
+          <wp:inline distT="0" distB="0" distL="0" distR="0" wp14:anchorId="13042254" wp14:editId="633915E2">
+            <wp:extent cx="8229600" cy="3704590"/>
+            <wp:effectExtent l="0" t="0" r="0" b="0"/>
+            <wp:docPr id="1095584108" name="Picture 1"/>
             <wp:cNvGraphicFramePr>
               <a:graphicFrameLocks xmlns:a="http://schemas.openxmlformats.org/drawingml/2006/main" noChangeAspect="1"/>
             </wp:cNvGraphicFramePr>
@@ -3095,7 +2971,7 @@
               <a:graphicData uri="http://schemas.openxmlformats.org/drawingml/2006/picture">
                 <pic:pic xmlns:pic="http://schemas.openxmlformats.org/drawingml/2006/picture">
                   <pic:nvPicPr>
-                    <pic:cNvPr id="1998037273" name=""/>
+                    <pic:cNvPr id="1095584108" name=""/>
                     <pic:cNvPicPr/>
                   </pic:nvPicPr>
                   <pic:blipFill>
@@ -3107,7 +2983,7 @@
                   <pic:spPr>
                     <a:xfrm>
                       <a:off x="0" y="0"/>
-                      <a:ext cx="7125694" cy="3610479"/>
+                      <a:ext cx="8229600" cy="3704590"/>
                     </a:xfrm>
                     <a:prstGeom prst="rect">
                       <a:avLst/>
@@ -3161,14 +3037,13 @@
       <w:r>
         <w:rPr>
           <w:rFonts w:asciiTheme="majorHAnsi" w:hAnsiTheme="majorHAnsi" w:cstheme="majorHAnsi"/>
-          <w:noProof/>
           <w:lang w:val="en-GB"/>
         </w:rPr>
         <w:drawing>
-          <wp:inline distT="0" distB="0" distL="0" distR="0" wp14:anchorId="03F7769F" wp14:editId="478E6337">
-            <wp:extent cx="7049484" cy="3124636"/>
+          <wp:inline distT="0" distB="0" distL="0" distR="0" wp14:anchorId="6B08C108" wp14:editId="2C477C0C">
+            <wp:extent cx="8229600" cy="3742055"/>
             <wp:effectExtent l="0" t="0" r="0" b="0"/>
-            <wp:docPr id="1043920607" name="Picture 1"/>
+            <wp:docPr id="858523617" name="Picture 1"/>
             <wp:cNvGraphicFramePr>
               <a:graphicFrameLocks xmlns:a="http://schemas.openxmlformats.org/drawingml/2006/main" noChangeAspect="1"/>
             </wp:cNvGraphicFramePr>
@@ -3176,7 +3051,7 @@
               <a:graphicData uri="http://schemas.openxmlformats.org/drawingml/2006/picture">
                 <pic:pic xmlns:pic="http://schemas.openxmlformats.org/drawingml/2006/picture">
                   <pic:nvPicPr>
-                    <pic:cNvPr id="1043920607" name=""/>
+                    <pic:cNvPr id="858523617" name=""/>
                     <pic:cNvPicPr/>
                   </pic:nvPicPr>
                   <pic:blipFill>
@@ -3188,7 +3063,7 @@
                   <pic:spPr>
                     <a:xfrm>
                       <a:off x="0" y="0"/>
-                      <a:ext cx="7049484" cy="3124636"/>
+                      <a:ext cx="8229600" cy="3742055"/>
                     </a:xfrm>
                     <a:prstGeom prst="rect">
                       <a:avLst/>
@@ -3242,14 +3117,13 @@
       <w:r>
         <w:rPr>
           <w:rFonts w:asciiTheme="majorHAnsi" w:hAnsiTheme="majorHAnsi" w:cstheme="majorHAnsi"/>
-          <w:noProof/>
           <w:lang w:val="en-GB"/>
         </w:rPr>
         <w:drawing>
-          <wp:inline distT="0" distB="0" distL="0" distR="0" wp14:anchorId="5AEC26B4" wp14:editId="30959F95">
-            <wp:extent cx="7259063" cy="3715268"/>
+          <wp:inline distT="0" distB="0" distL="0" distR="0" wp14:anchorId="2A95F72E" wp14:editId="69A79384">
+            <wp:extent cx="8229600" cy="2211705"/>
             <wp:effectExtent l="0" t="0" r="0" b="0"/>
-            <wp:docPr id="834895221" name="Picture 1"/>
+            <wp:docPr id="2000594508" name="Picture 1"/>
             <wp:cNvGraphicFramePr>
               <a:graphicFrameLocks xmlns:a="http://schemas.openxmlformats.org/drawingml/2006/main" noChangeAspect="1"/>
             </wp:cNvGraphicFramePr>
@@ -3257,7 +3131,7 @@
               <a:graphicData uri="http://schemas.openxmlformats.org/drawingml/2006/picture">
                 <pic:pic xmlns:pic="http://schemas.openxmlformats.org/drawingml/2006/picture">
                   <pic:nvPicPr>
-                    <pic:cNvPr id="834895221" name=""/>
+                    <pic:cNvPr id="2000594508" name=""/>
                     <pic:cNvPicPr/>
                   </pic:nvPicPr>
                   <pic:blipFill>
@@ -3269,7 +3143,7 @@
                   <pic:spPr>
                     <a:xfrm>
                       <a:off x="0" y="0"/>
-                      <a:ext cx="7259063" cy="3715268"/>
+                      <a:ext cx="8229600" cy="2211705"/>
                     </a:xfrm>
                     <a:prstGeom prst="rect">
                       <a:avLst/>
@@ -3323,14 +3197,13 @@
       <w:r>
         <w:rPr>
           <w:rFonts w:asciiTheme="majorHAnsi" w:hAnsiTheme="majorHAnsi" w:cstheme="majorHAnsi"/>
-          <w:noProof/>
           <w:lang w:val="en-GB"/>
         </w:rPr>
         <w:drawing>
-          <wp:inline distT="0" distB="0" distL="0" distR="0" wp14:anchorId="525C2616" wp14:editId="342DF6FB">
-            <wp:extent cx="7125694" cy="3153215"/>
-            <wp:effectExtent l="0" t="0" r="0" b="9525"/>
-            <wp:docPr id="216358063" name="Picture 1"/>
+          <wp:inline distT="0" distB="0" distL="0" distR="0" wp14:anchorId="0FA4EDAC" wp14:editId="6D70FD72">
+            <wp:extent cx="8229600" cy="2915920"/>
+            <wp:effectExtent l="0" t="0" r="0" b="0"/>
+            <wp:docPr id="1467293425" name="Picture 1"/>
             <wp:cNvGraphicFramePr>
               <a:graphicFrameLocks xmlns:a="http://schemas.openxmlformats.org/drawingml/2006/main" noChangeAspect="1"/>
             </wp:cNvGraphicFramePr>
@@ -3338,7 +3211,7 @@
               <a:graphicData uri="http://schemas.openxmlformats.org/drawingml/2006/picture">
                 <pic:pic xmlns:pic="http://schemas.openxmlformats.org/drawingml/2006/picture">
                   <pic:nvPicPr>
-                    <pic:cNvPr id="216358063" name=""/>
+                    <pic:cNvPr id="1467293425" name=""/>
                     <pic:cNvPicPr/>
                   </pic:nvPicPr>
                   <pic:blipFill>
@@ -3350,7 +3223,7 @@
                   <pic:spPr>
                     <a:xfrm>
                       <a:off x="0" y="0"/>
-                      <a:ext cx="7125694" cy="3153215"/>
+                      <a:ext cx="8229600" cy="2915920"/>
                     </a:xfrm>
                     <a:prstGeom prst="rect">
                       <a:avLst/>
@@ -3404,14 +3277,13 @@
       <w:r>
         <w:rPr>
           <w:rFonts w:asciiTheme="majorHAnsi" w:hAnsiTheme="majorHAnsi" w:cstheme="majorHAnsi"/>
-          <w:noProof/>
           <w:lang w:val="en-GB"/>
         </w:rPr>
         <w:drawing>
-          <wp:inline distT="0" distB="0" distL="0" distR="0" wp14:anchorId="47F54D63" wp14:editId="21D90D96">
-            <wp:extent cx="5761718" cy="4991100"/>
+          <wp:inline distT="0" distB="0" distL="0" distR="0" wp14:anchorId="4907F24A" wp14:editId="4A947A9D">
+            <wp:extent cx="8229600" cy="1735455"/>
             <wp:effectExtent l="0" t="0" r="0" b="0"/>
-            <wp:docPr id="1124361972" name="Picture 1"/>
+            <wp:docPr id="545627057" name="Picture 1"/>
             <wp:cNvGraphicFramePr>
               <a:graphicFrameLocks xmlns:a="http://schemas.openxmlformats.org/drawingml/2006/main" noChangeAspect="1"/>
             </wp:cNvGraphicFramePr>
@@ -3419,7 +3291,7 @@
               <a:graphicData uri="http://schemas.openxmlformats.org/drawingml/2006/picture">
                 <pic:pic xmlns:pic="http://schemas.openxmlformats.org/drawingml/2006/picture">
                   <pic:nvPicPr>
-                    <pic:cNvPr id="1124361972" name=""/>
+                    <pic:cNvPr id="545627057" name=""/>
                     <pic:cNvPicPr/>
                   </pic:nvPicPr>
                   <pic:blipFill>
@@ -3431,7 +3303,7 @@
                   <pic:spPr>
                     <a:xfrm>
                       <a:off x="0" y="0"/>
-                      <a:ext cx="5773652" cy="5001438"/>
+                      <a:ext cx="8229600" cy="1735455"/>
                     </a:xfrm>
                     <a:prstGeom prst="rect">
                       <a:avLst/>
@@ -3456,7 +3328,6 @@
           <w:rFonts w:asciiTheme="majorHAnsi" w:hAnsiTheme="majorHAnsi" w:cstheme="majorHAnsi"/>
           <w:lang w:val="en-GB"/>
         </w:rPr>
-        <w:lastRenderedPageBreak/>
         <w:br w:type="page"/>
       </w:r>
     </w:p>
@@ -3486,14 +3357,13 @@
       <w:r>
         <w:rPr>
           <w:rFonts w:asciiTheme="majorHAnsi" w:hAnsiTheme="majorHAnsi" w:cstheme="majorHAnsi"/>
-          <w:noProof/>
           <w:lang w:val="en-GB"/>
         </w:rPr>
         <w:drawing>
-          <wp:inline distT="0" distB="0" distL="0" distR="0" wp14:anchorId="7037F2EA" wp14:editId="4E1AE3D3">
-            <wp:extent cx="5288280" cy="4933421"/>
-            <wp:effectExtent l="0" t="0" r="7620" b="635"/>
-            <wp:docPr id="1341737196" name="Picture 1"/>
+          <wp:inline distT="0" distB="0" distL="0" distR="0" wp14:anchorId="0146657A" wp14:editId="04AFB112">
+            <wp:extent cx="8229600" cy="2208530"/>
+            <wp:effectExtent l="0" t="0" r="0" b="1270"/>
+            <wp:docPr id="1293265051" name="Picture 1"/>
             <wp:cNvGraphicFramePr>
               <a:graphicFrameLocks xmlns:a="http://schemas.openxmlformats.org/drawingml/2006/main" noChangeAspect="1"/>
             </wp:cNvGraphicFramePr>
@@ -3501,7 +3371,7 @@
               <a:graphicData uri="http://schemas.openxmlformats.org/drawingml/2006/picture">
                 <pic:pic xmlns:pic="http://schemas.openxmlformats.org/drawingml/2006/picture">
                   <pic:nvPicPr>
-                    <pic:cNvPr id="1341737196" name=""/>
+                    <pic:cNvPr id="1293265051" name=""/>
                     <pic:cNvPicPr/>
                   </pic:nvPicPr>
                   <pic:blipFill>
@@ -3513,7 +3383,7 @@
                   <pic:spPr>
                     <a:xfrm>
                       <a:off x="0" y="0"/>
-                      <a:ext cx="5288618" cy="4933736"/>
+                      <a:ext cx="8229600" cy="2208530"/>
                     </a:xfrm>
                     <a:prstGeom prst="rect">
                       <a:avLst/>
@@ -3524,6 +3394,13 @@
             </a:graphic>
           </wp:inline>
         </w:drawing>
+      </w:r>
+      <w:r>
+        <w:rPr>
+          <w:rFonts w:asciiTheme="majorHAnsi" w:hAnsiTheme="majorHAnsi" w:cstheme="majorHAnsi"/>
+          <w:lang w:val="en-GB"/>
+        </w:rPr>
+        <w:t xml:space="preserve"> </w:t>
       </w:r>
       <w:r>
         <w:rPr>
@@ -3559,14 +3436,13 @@
       <w:r>
         <w:rPr>
           <w:rFonts w:asciiTheme="majorHAnsi" w:hAnsiTheme="majorHAnsi" w:cstheme="majorHAnsi"/>
-          <w:noProof/>
           <w:lang w:val="en-GB"/>
         </w:rPr>
         <w:drawing>
-          <wp:inline distT="0" distB="0" distL="0" distR="0" wp14:anchorId="2BD56BF2" wp14:editId="1EF0A3BC">
-            <wp:extent cx="5585460" cy="5061258"/>
-            <wp:effectExtent l="0" t="0" r="0" b="6350"/>
-            <wp:docPr id="202213987" name="Picture 1"/>
+          <wp:inline distT="0" distB="0" distL="0" distR="0" wp14:anchorId="6CEDC8C5" wp14:editId="6EE078D1">
+            <wp:extent cx="6289950" cy="4791075"/>
+            <wp:effectExtent l="0" t="0" r="0" b="0"/>
+            <wp:docPr id="836555125" name="Picture 1"/>
             <wp:cNvGraphicFramePr>
               <a:graphicFrameLocks xmlns:a="http://schemas.openxmlformats.org/drawingml/2006/main" noChangeAspect="1"/>
             </wp:cNvGraphicFramePr>
@@ -3574,7 +3450,7 @@
               <a:graphicData uri="http://schemas.openxmlformats.org/drawingml/2006/picture">
                 <pic:pic xmlns:pic="http://schemas.openxmlformats.org/drawingml/2006/picture">
                   <pic:nvPicPr>
-                    <pic:cNvPr id="202213987" name=""/>
+                    <pic:cNvPr id="836555125" name=""/>
                     <pic:cNvPicPr/>
                   </pic:nvPicPr>
                   <pic:blipFill>
@@ -3586,7 +3462,7 @@
                   <pic:spPr>
                     <a:xfrm>
                       <a:off x="0" y="0"/>
-                      <a:ext cx="5586287" cy="5062007"/>
+                      <a:ext cx="6291966" cy="4792611"/>
                     </a:xfrm>
                     <a:prstGeom prst="rect">
                       <a:avLst/>
@@ -3597,6 +3473,13 @@
             </a:graphic>
           </wp:inline>
         </w:drawing>
+      </w:r>
+      <w:r>
+        <w:rPr>
+          <w:rFonts w:asciiTheme="majorHAnsi" w:hAnsiTheme="majorHAnsi" w:cstheme="majorHAnsi"/>
+          <w:lang w:val="en-GB"/>
+        </w:rPr>
+        <w:t xml:space="preserve"> </w:t>
       </w:r>
       <w:r>
         <w:rPr>
@@ -3625,21 +3508,20 @@
     <w:p>
       <w:pPr>
         <w:rPr>
-          <w:rFonts w:asciiTheme="majorHAnsi" w:hAnsiTheme="majorHAnsi" w:cstheme="majorHAnsi"/>
-          <w:lang w:val="en-GB"/>
+          <w:rFonts w:asciiTheme="majorHAnsi" w:eastAsia="宋体" w:hAnsiTheme="majorHAnsi" w:cstheme="majorHAnsi" w:hint="eastAsia"/>
+          <w:lang w:val="en-GB" w:eastAsia="zh-CN"/>
         </w:rPr>
       </w:pPr>
       <w:r>
         <w:rPr>
-          <w:rFonts w:asciiTheme="majorHAnsi" w:hAnsiTheme="majorHAnsi" w:cstheme="majorHAnsi"/>
-          <w:noProof/>
-          <w:lang w:val="en-GB"/>
+          <w:rFonts w:asciiTheme="majorHAnsi" w:eastAsia="宋体" w:hAnsiTheme="majorHAnsi" w:cstheme="majorHAnsi"/>
+          <w:lang w:val="en-GB" w:eastAsia="zh-CN"/>
         </w:rPr>
         <w:drawing>
-          <wp:inline distT="0" distB="0" distL="0" distR="0" wp14:anchorId="1B71470E" wp14:editId="50684888">
-            <wp:extent cx="8229600" cy="2132330"/>
-            <wp:effectExtent l="0" t="0" r="0" b="1270"/>
-            <wp:docPr id="1708206028" name="Picture 1"/>
+          <wp:inline distT="0" distB="0" distL="0" distR="0" wp14:anchorId="667E943D" wp14:editId="0D289D2E">
+            <wp:extent cx="8229600" cy="2222500"/>
+            <wp:effectExtent l="0" t="0" r="0" b="6350"/>
+            <wp:docPr id="378540339" name="Picture 1"/>
             <wp:cNvGraphicFramePr>
               <a:graphicFrameLocks xmlns:a="http://schemas.openxmlformats.org/drawingml/2006/main" noChangeAspect="1"/>
             </wp:cNvGraphicFramePr>
@@ -3647,7 +3529,7 @@
               <a:graphicData uri="http://schemas.openxmlformats.org/drawingml/2006/picture">
                 <pic:pic xmlns:pic="http://schemas.openxmlformats.org/drawingml/2006/picture">
                   <pic:nvPicPr>
-                    <pic:cNvPr id="1708206028" name=""/>
+                    <pic:cNvPr id="378540339" name=""/>
                     <pic:cNvPicPr/>
                   </pic:nvPicPr>
                   <pic:blipFill>
@@ -3659,72 +3541,7 @@
                   <pic:spPr>
                     <a:xfrm>
                       <a:off x="0" y="0"/>
-                      <a:ext cx="8229600" cy="2132330"/>
-                    </a:xfrm>
-                    <a:prstGeom prst="rect">
-                      <a:avLst/>
-                    </a:prstGeom>
-                  </pic:spPr>
-                </pic:pic>
-              </a:graphicData>
-            </a:graphic>
-          </wp:inline>
-        </w:drawing>
-      </w:r>
-    </w:p>
-    <w:p>
-      <w:pPr>
-        <w:rPr>
-          <w:rFonts w:asciiTheme="majorHAnsi" w:hAnsiTheme="majorHAnsi" w:cstheme="majorHAnsi"/>
-          <w:lang w:val="en-GB"/>
-        </w:rPr>
-      </w:pPr>
-      <w:r>
-        <w:rPr>
-          <w:rFonts w:asciiTheme="majorHAnsi" w:hAnsiTheme="majorHAnsi" w:cstheme="majorHAnsi"/>
-          <w:lang w:val="en-GB"/>
-        </w:rPr>
-        <w:t>Test 15:</w:t>
-      </w:r>
-    </w:p>
-    <w:p>
-      <w:pPr>
-        <w:rPr>
-          <w:rFonts w:asciiTheme="majorHAnsi" w:hAnsiTheme="majorHAnsi" w:cstheme="majorHAnsi"/>
-          <w:lang w:val="en-GB"/>
-        </w:rPr>
-      </w:pPr>
-      <w:r>
-        <w:rPr>
-          <w:rFonts w:asciiTheme="majorHAnsi" w:hAnsiTheme="majorHAnsi" w:cstheme="majorHAnsi"/>
-          <w:noProof/>
-          <w:lang w:val="en-GB"/>
-        </w:rPr>
-        <w:drawing>
-          <wp:inline distT="0" distB="0" distL="0" distR="0" wp14:anchorId="449EE056" wp14:editId="20E89E96">
-            <wp:extent cx="5974080" cy="2225529"/>
-            <wp:effectExtent l="0" t="0" r="7620" b="3810"/>
-            <wp:docPr id="106543011" name="Picture 1"/>
-            <wp:cNvGraphicFramePr>
-              <a:graphicFrameLocks xmlns:a="http://schemas.openxmlformats.org/drawingml/2006/main" noChangeAspect="1"/>
-            </wp:cNvGraphicFramePr>
-            <a:graphic xmlns:a="http://schemas.openxmlformats.org/drawingml/2006/main">
-              <a:graphicData uri="http://schemas.openxmlformats.org/drawingml/2006/picture">
-                <pic:pic xmlns:pic="http://schemas.openxmlformats.org/drawingml/2006/picture">
-                  <pic:nvPicPr>
-                    <pic:cNvPr id="106543011" name=""/>
-                    <pic:cNvPicPr/>
-                  </pic:nvPicPr>
-                  <pic:blipFill>
-                    <a:blip r:embed="rId22"/>
-                    <a:stretch>
-                      <a:fillRect/>
-                    </a:stretch>
-                  </pic:blipFill>
-                  <pic:spPr>
-                    <a:xfrm>
-                      <a:off x="0" y="0"/>
-                      <a:ext cx="5981507" cy="2228296"/>
+                      <a:ext cx="8229600" cy="2222500"/>
                     </a:xfrm>
                     <a:prstGeom prst="rect">
                       <a:avLst/>

</xml_diff>